<commit_message>
feat(training): add Word forms, paper copy tracking and vendor lifecycle
</commit_message>
<xml_diff>
--- a/eqms-backend/docs/validation/evidence/training_2026_10_18/exports/APD0117-after-training.docx
+++ b/eqms-backend/docs/validation/evidence/training_2026_10_18/exports/APD0117-after-training.docx
@@ -2,281 +2,6 @@
 <file path=word/document.xml><?xml version="1.0" encoding="utf-8"?>
 <w:document xmlns:wpc="http://schemas.microsoft.com/office/word/2010/wordprocessingCanvas" xmlns:cx="http://schemas.microsoft.com/office/drawing/2014/chartex" xmlns:cx1="http://schemas.microsoft.com/office/drawing/2015/9/8/chartex" xmlns:cx2="http://schemas.microsoft.com/office/drawing/2015/10/21/chartex" xmlns:cx3="http://schemas.microsoft.com/office/drawing/2016/5/9/chartex" xmlns:cx4="http://schemas.microsoft.com/office/drawing/2016/5/10/chartex" xmlns:cx5="http://schemas.microsoft.com/office/drawing/2016/5/11/chartex" xmlns:cx6="http://schemas.microsoft.com/office/drawing/2016/5/12/chartex" xmlns:cx7="http://schemas.microsoft.com/office/drawing/2016/5/13/chartex" xmlns:cx8="http://schemas.microsoft.com/office/drawing/2016/5/14/chartex" xmlns:mc="http://schemas.openxmlformats.org/markup-compatibility/2006" xmlns:aink="http://schemas.microsoft.com/office/drawing/2016/ink" xmlns:am3d="http://schemas.microsoft.com/office/drawing/2017/model3d" xmlns:o="urn:schemas-microsoft-com:office:office" xmlns:oel="http://schemas.microsoft.com/office/2019/extlst" xmlns:r="http://schemas.openxmlformats.org/officeDocument/2006/relationships" xmlns:m="http://schemas.openxmlformats.org/officeDocument/2006/math" xmlns:v="urn:schemas-microsoft-com:vml" xmlns:wp14="http://schemas.microsoft.com/office/word/2010/wordprocessingDrawing" xmlns:wp="http://schemas.openxmlformats.org/drawingml/2006/wordprocessingDrawing" xmlns:w10="urn:schemas-microsoft-com:office:word" xmlns:w="http://schemas.openxmlformats.org/wordprocessingml/2006/main" xmlns:w14="http://schemas.microsoft.com/office/word/2010/wordml" xmlns:w15="http://schemas.microsoft.com/office/word/2012/wordml" xmlns:w16cex="http://schemas.microsoft.com/office/word/2018/wordml/cex" xmlns:w16cid="http://schemas.microsoft.com/office/word/2016/wordml/cid" xmlns:w16="http://schemas.microsoft.com/office/word/2018/wordml" xmlns:w16du="http://schemas.microsoft.com/office/word/2023/wordml/word16du" xmlns:w16sdtdh="http://schemas.microsoft.com/office/word/2020/wordml/sdtdatahash" xmlns:w16sdtfl="http://schemas.microsoft.com/office/word/2024/wordml/sdtformatlock" xmlns:w16se="http://schemas.microsoft.com/office/word/2015/wordml/symex" xmlns:wpg="http://schemas.microsoft.com/office/word/2010/wordprocessingGroup" xmlns:wpi="http://schemas.microsoft.com/office/word/2010/wordprocessingInk" xmlns:wne="http://schemas.microsoft.com/office/word/2006/wordml" xmlns:wps="http://schemas.microsoft.com/office/word/2010/wordprocessingShape" mc:Ignorable="w14 w15 w16se w16cid w16 w16cex w16sdtdh w16sdtfl w16du wp14">
   <w:body>
-    <w:tbl>
-      <w:tblPr>
-        <w:tblW w:w="9639" w:type="dxa"/>
-        <w:tblInd w:w="108" w:type="dxa"/>
-        <w:tblBorders>
-          <w:top w:val="single" w:sz="8" w:space="0" w:color="auto"/>
-          <w:left w:val="single" w:sz="8" w:space="0" w:color="auto"/>
-          <w:bottom w:val="single" w:sz="8" w:space="0" w:color="auto"/>
-          <w:right w:val="single" w:sz="8" w:space="0" w:color="auto"/>
-          <w:insideH w:val="single" w:sz="8" w:space="0" w:color="auto"/>
-          <w:insideV w:val="single" w:sz="8" w:space="0" w:color="auto"/>
-        </w:tblBorders>
-        <w:tblLayout w:type="fixed"/>
-        <w:tblLook w:val="0000" w:firstRow="0" w:lastRow="0" w:firstColumn="0" w:lastColumn="0" w:noHBand="0" w:noVBand="0"/>
-      </w:tblPr>
-      <w:tblGrid>
-        <w:gridCol w:w="2268"/>
-        <w:gridCol w:w="5418"/>
-        <w:gridCol w:w="1953"/>
-      </w:tblGrid>
-      <w:tr>
-        <w:trPr>
-          <w:cantSplit/>
-          <w:trHeight w:val="702"/>
-        </w:trPr>
-        <w:tc>
-          <w:tcPr>
-            <w:tcW w:w="2268" w:type="dxa"/>
-            <w:vMerge w:val="restart"/>
-            <w:tcBorders>
-              <w:top w:val="single" w:sz="2" w:space="0" w:color="auto"/>
-              <w:left w:val="single" w:sz="2" w:space="0" w:color="auto"/>
-              <w:right w:val="single" w:sz="2" w:space="0" w:color="auto"/>
-            </w:tcBorders>
-            <w:vAlign w:val="center"/>
-          </w:tcPr>
-          <w:p>
-            <w:pPr>
-              <w:spacing w:line="312" w:lineRule="auto"/>
-              <w:jc w:val="center"/>
-              <w:rPr>
-                <w:rFonts w:cs="Times New Roman"/>
-                <w:b/>
-                <w:szCs w:val="24"/>
-              </w:rPr>
-            </w:pPr>
-            <w:r>
-              <w:rPr>
-                <w:rFonts w:cs="Times New Roman"/>
-                <w:noProof/>
-                <w:szCs w:val="24"/>
-              </w:rPr>
-              <w:drawing>
-                <wp:inline distT="0" distB="0" distL="0" distR="0" wp14:anchorId="091E0B2F" wp14:editId="2235FB2A">
-                  <wp:extent cx="1135380" cy="823843"/>
-                  <wp:effectExtent l="0" t="0" r="7620" b="0"/>
-                  <wp:docPr id="1423875943" name="Picture 1423875943"/>
-                  <wp:cNvGraphicFramePr>
-                    <a:graphicFrameLocks xmlns:a="http://schemas.openxmlformats.org/drawingml/2006/main" noChangeAspect="1"/>
-                  </wp:cNvGraphicFramePr>
-                  <a:graphic xmlns:a="http://schemas.openxmlformats.org/drawingml/2006/main">
-                    <a:graphicData uri="http://schemas.openxmlformats.org/drawingml/2006/picture">
-                      <pic:pic xmlns:pic="http://schemas.openxmlformats.org/drawingml/2006/picture">
-                        <pic:nvPicPr>
-                          <pic:cNvPr id="0" name="Picture 1"/>
-                          <pic:cNvPicPr>
-                            <a:picLocks noChangeAspect="1" noChangeArrowheads="1"/>
-                          </pic:cNvPicPr>
-                        </pic:nvPicPr>
-                        <pic:blipFill>
-                          <a:blip r:embed="rId11" cstate="print">
-                            <a:extLst>
-                              <a:ext uri="{28A0092B-C50C-407E-A947-70E740481C1C}">
-                                <a14:useLocalDpi xmlns:a14="http://schemas.microsoft.com/office/drawing/2010/main" val="0"/>
-                              </a:ext>
-                            </a:extLst>
-                          </a:blip>
-                          <a:srcRect/>
-                          <a:stretch>
-                            <a:fillRect/>
-                          </a:stretch>
-                        </pic:blipFill>
-                        <pic:spPr bwMode="auto">
-                          <a:xfrm>
-                            <a:off x="0" y="0"/>
-                            <a:ext cx="1137773" cy="825580"/>
-                          </a:xfrm>
-                          <a:prstGeom prst="rect">
-                            <a:avLst/>
-                          </a:prstGeom>
-                          <a:noFill/>
-                          <a:ln>
-                            <a:noFill/>
-                          </a:ln>
-                        </pic:spPr>
-                      </pic:pic>
-                    </a:graphicData>
-                  </a:graphic>
-                </wp:inline>
-              </w:drawing>
-            </w:r>
-          </w:p>
-        </w:tc>
-        <w:tc>
-          <w:tcPr>
-            <w:tcW w:w="5418" w:type="dxa"/>
-            <w:vMerge w:val="restart"/>
-            <w:tcBorders>
-              <w:top w:val="single" w:sz="2" w:space="0" w:color="auto"/>
-              <w:left w:val="single" w:sz="2" w:space="0" w:color="auto"/>
-              <w:right w:val="single" w:sz="2" w:space="0" w:color="auto"/>
-            </w:tcBorders>
-            <w:vAlign w:val="center"/>
-          </w:tcPr>
-          <w:p>
-            <w:pPr>
-              <w:spacing w:line="300" w:lineRule="auto"/>
-              <w:jc w:val="center"/>
-              <w:rPr>
-                <w:b/>
-                <w:sz w:val="30"/>
-                <w:szCs w:val="30"/>
-              </w:rPr>
-            </w:pPr>
-            <w:r>
-              <w:rPr>
-                <w:b/>
-                <w:sz w:val="30"/>
-                <w:szCs w:val="30"/>
-              </w:rPr>
-              <w:t>DANH SÁCH THAM GIA ĐÀO TẠO</w:t>
-            </w:r>
-          </w:p>
-          <w:p>
-            <w:pPr>
-              <w:spacing w:line="300" w:lineRule="auto"/>
-              <w:jc w:val="center"/>
-              <w:rPr>
-                <w:rFonts w:cs="Times New Roman"/>
-                <w:b/>
-                <w:szCs w:val="24"/>
-              </w:rPr>
-            </w:pPr>
-            <w:r>
-              <w:rPr>
-                <w:b/>
-                <w:i/>
-                <w:iCs/>
-                <w:sz w:val="30"/>
-                <w:szCs w:val="30"/>
-              </w:rPr>
-              <w:t xml:space="preserve">TRAINING ATTENDENCE LIST </w:t>
-            </w:r>
-          </w:p>
-        </w:tc>
-        <w:tc>
-          <w:tcPr>
-            <w:tcW w:w="1953" w:type="dxa"/>
-            <w:tcBorders>
-              <w:top w:val="single" w:sz="2" w:space="0" w:color="auto"/>
-              <w:left w:val="single" w:sz="2" w:space="0" w:color="auto"/>
-              <w:bottom w:val="single" w:sz="2" w:space="0" w:color="auto"/>
-              <w:right w:val="single" w:sz="2" w:space="0" w:color="auto"/>
-            </w:tcBorders>
-            <w:vAlign w:val="center"/>
-          </w:tcPr>
-          <w:p>
-            <w:pPr>
-              <w:spacing w:line="312" w:lineRule="auto"/>
-              <w:jc w:val="both"/>
-              <w:rPr>
-                <w:rFonts w:cs="Times New Roman"/>
-                <w:szCs w:val="24"/>
-                <w:lang w:val="vi-VN"/>
-              </w:rPr>
-            </w:pPr>
-            <w:r>
-              <w:rPr>
-                <w:rFonts w:cs="Times New Roman"/>
-                <w:szCs w:val="24"/>
-              </w:rPr>
-              <w:t>Page:</w:t>
-            </w:r>
-            <w:r>
-              <w:rPr>
-                <w:rFonts w:cs="Times New Roman"/>
-                <w:szCs w:val="24"/>
-                <w:lang w:val="vi-VN"/>
-              </w:rPr>
-              <w:t>.../...</w:t>
-            </w:r>
-          </w:p>
-        </w:tc>
-      </w:tr>
-      <w:tr>
-        <w:trPr>
-          <w:cantSplit/>
-          <w:trHeight w:val="702"/>
-        </w:trPr>
-        <w:tc>
-          <w:tcPr>
-            <w:tcW w:w="2268" w:type="dxa"/>
-            <w:vMerge/>
-            <w:tcBorders>
-              <w:left w:val="single" w:sz="2" w:space="0" w:color="auto"/>
-              <w:bottom w:val="single" w:sz="8" w:space="0" w:color="auto"/>
-              <w:right w:val="single" w:sz="2" w:space="0" w:color="auto"/>
-            </w:tcBorders>
-            <w:vAlign w:val="center"/>
-          </w:tcPr>
-          <w:p>
-            <w:pPr>
-              <w:spacing w:line="312" w:lineRule="auto"/>
-              <w:jc w:val="center"/>
-              <w:rPr>
-                <w:rFonts w:cs="Times New Roman"/>
-                <w:noProof/>
-                <w:szCs w:val="24"/>
-              </w:rPr>
-            </w:pPr>
-          </w:p>
-        </w:tc>
-        <w:tc>
-          <w:tcPr>
-            <w:tcW w:w="5418" w:type="dxa"/>
-            <w:vMerge/>
-            <w:tcBorders>
-              <w:left w:val="single" w:sz="2" w:space="0" w:color="auto"/>
-              <w:bottom w:val="single" w:sz="8" w:space="0" w:color="auto"/>
-              <w:right w:val="single" w:sz="2" w:space="0" w:color="auto"/>
-            </w:tcBorders>
-            <w:vAlign w:val="center"/>
-          </w:tcPr>
-          <w:p>
-            <w:pPr>
-              <w:spacing w:line="300" w:lineRule="auto"/>
-              <w:jc w:val="center"/>
-              <w:rPr>
-                <w:b/>
-                <w:sz w:val="30"/>
-                <w:szCs w:val="30"/>
-              </w:rPr>
-            </w:pPr>
-          </w:p>
-        </w:tc>
-        <w:tc>
-          <w:tcPr>
-            <w:tcW w:w="1953" w:type="dxa"/>
-            <w:tcBorders>
-              <w:top w:val="single" w:sz="2" w:space="0" w:color="auto"/>
-              <w:left w:val="single" w:sz="2" w:space="0" w:color="auto"/>
-              <w:right w:val="single" w:sz="2" w:space="0" w:color="auto"/>
-            </w:tcBorders>
-            <w:vAlign w:val="center"/>
-          </w:tcPr>
-          <w:p>
-            <w:pPr>
-              <w:spacing w:line="312" w:lineRule="auto"/>
-              <w:jc w:val="both"/>
-              <w:rPr>
-                <w:rFonts w:cs="Times New Roman"/>
-                <w:szCs w:val="24"/>
-              </w:rPr>
-            </w:pPr>
-            <w:r>
-              <w:rPr>
-                <w:rFonts w:cs="Times New Roman"/>
-                <w:szCs w:val="24"/>
-              </w:rPr>
-              <w:t xml:space="preserve">Code: TRN/QA/26-402</w:t>
-            </w:r>
-          </w:p>
-        </w:tc>
-      </w:tr>
-    </w:tbl>
     <w:bookmarkEnd w:id="0"/>
     <w:p>
       <w:pPr>
@@ -415,8 +140,10 @@
             </w:pPr>
             <w:r>
               <w:rPr>
-                <w:rFonts w:cs="Times New Roman"/>
-                <w:szCs w:val="24"/>
+                <w:rFonts w:cs="Times New Roman" w:ascii="Times New Roman" w:hAnsi="Times New Roman" w:eastAsia="Times New Roman"/>
+                <w:szCs w:val="24"/>
+                <w:sz w:val="24"/>
+                <w:i w:val="off"/>
               </w:rPr>
               <w:t>E2E-TEST attendance list APD.0117</w:t>
             </w:r>
@@ -483,8 +210,10 @@
             </w:pPr>
             <w:r>
               <w:rPr>
-                <w:rFonts w:cs="Times New Roman"/>
-                <w:szCs w:val="24"/>
+                <w:rFonts w:cs="Times New Roman" w:ascii="Times New Roman" w:hAnsi="Times New Roman" w:eastAsia="Times New Roman"/>
+                <w:szCs w:val="24"/>
+                <w:sz w:val="24"/>
+                <w:i w:val="off"/>
               </w:rPr>
               <w:t>Quality Assurance</w:t>
             </w:r>
@@ -551,8 +280,10 @@
             </w:pPr>
             <w:r>
               <w:rPr>
-                <w:rFonts w:cs="Times New Roman"/>
-                <w:szCs w:val="24"/>
+                <w:rFonts w:cs="Times New Roman" w:ascii="Times New Roman" w:hAnsi="Times New Roman" w:eastAsia="Times New Roman"/>
+                <w:szCs w:val="24"/>
+                <w:sz w:val="24"/>
+                <w:i w:val="off"/>
               </w:rPr>
               <w:t>Đột xuất / Unplanned (new sop)</w:t>
             </w:r>
@@ -822,6 +553,11 @@
               </w:rPr>
             </w:pPr>
             <w:r>
+              <w:rPr>
+                <w:rFonts w:ascii="Times New Roman" w:hAnsi="Times New Roman" w:cs="Times New Roman" w:eastAsia="Times New Roman"/>
+                <w:sz w:val="24"/>
+                <w:i w:val="off"/>
+              </w:rPr>
               <w:t>01</w:t>
             </w:r>
           </w:p>
@@ -843,6 +579,11 @@
               </w:rPr>
             </w:pPr>
             <w:r>
+              <w:rPr>
+                <w:rFonts w:ascii="Times New Roman" w:hAnsi="Times New Roman" w:cs="Times New Roman" w:eastAsia="Times New Roman"/>
+                <w:sz w:val="24"/>
+                <w:i w:val="off"/>
+              </w:rPr>
               <w:t/>
             </w:r>
           </w:p>
@@ -864,6 +605,11 @@
               </w:rPr>
             </w:pPr>
             <w:r>
+              <w:rPr>
+                <w:rFonts w:ascii="Times New Roman" w:hAnsi="Times New Roman" w:cs="Times New Roman" w:eastAsia="Times New Roman"/>
+                <w:sz w:val="24"/>
+                <w:i w:val="off"/>
+              </w:rPr>
               <w:t>E2E-TEST first topic</w:t>
             </w:r>
           </w:p>
@@ -885,6 +631,11 @@
               </w:rPr>
             </w:pPr>
             <w:r>
+              <w:rPr>
+                <w:rFonts w:ascii="Times New Roman" w:hAnsi="Times New Roman" w:cs="Times New Roman" w:eastAsia="Times New Roman"/>
+                <w:sz w:val="24"/>
+                <w:i w:val="off"/>
+              </w:rPr>
               <w:t>Tập trung / Classroom</w:t>
             </w:r>
           </w:p>
@@ -906,6 +657,11 @@
               </w:rPr>
             </w:pPr>
             <w:r>
+              <w:rPr>
+                <w:rFonts w:ascii="Times New Roman" w:hAnsi="Times New Roman" w:cs="Times New Roman" w:eastAsia="Times New Roman"/>
+                <w:sz w:val="24"/>
+                <w:i w:val="off"/>
+              </w:rPr>
               <w:t>Tran Van Ngoai</w:t>
             </w:r>
           </w:p>
@@ -926,7 +682,12 @@
               </w:rPr>
             </w:pPr>
             <w:r>
-              <w:t>24/10/2026</w:t>
+              <w:rPr>
+                <w:rFonts w:ascii="Times New Roman" w:hAnsi="Times New Roman" w:cs="Times New Roman" w:eastAsia="Times New Roman"/>
+                <w:sz w:val="24"/>
+                <w:i w:val="off"/>
+              </w:rPr>
+              <w:t>25/10/2026</w:t>
             </w:r>
           </w:p>
         </w:tc>
@@ -948,6 +709,11 @@
               </w:rPr>
             </w:pPr>
             <w:r>
+              <w:rPr>
+                <w:rFonts w:ascii="Times New Roman" w:hAnsi="Times New Roman" w:cs="Times New Roman" w:eastAsia="Times New Roman"/>
+                <w:sz w:val="24"/>
+                <w:i w:val="off"/>
+              </w:rPr>
               <w:t/>
             </w:r>
           </w:p>
@@ -969,6 +735,11 @@
               </w:rPr>
             </w:pPr>
             <w:r>
+              <w:rPr>
+                <w:rFonts w:ascii="Times New Roman" w:hAnsi="Times New Roman" w:cs="Times New Roman" w:eastAsia="Times New Roman"/>
+                <w:sz w:val="24"/>
+                <w:i w:val="off"/>
+              </w:rPr>
               <w:t/>
             </w:r>
           </w:p>
@@ -990,6 +761,11 @@
               </w:rPr>
             </w:pPr>
             <w:r>
+              <w:rPr>
+                <w:rFonts w:ascii="Times New Roman" w:hAnsi="Times New Roman" w:cs="Times New Roman" w:eastAsia="Times New Roman"/>
+                <w:sz w:val="24"/>
+                <w:i w:val="off"/>
+              </w:rPr>
               <w:t>E2E-TEST second topic</w:t>
             </w:r>
           </w:p>
@@ -1011,6 +787,11 @@
               </w:rPr>
             </w:pPr>
             <w:r>
+              <w:rPr>
+                <w:rFonts w:ascii="Times New Roman" w:hAnsi="Times New Roman" w:cs="Times New Roman" w:eastAsia="Times New Roman"/>
+                <w:sz w:val="24"/>
+                <w:i w:val="off"/>
+              </w:rPr>
               <w:t/>
             </w:r>
           </w:p>
@@ -1032,6 +813,11 @@
               </w:rPr>
             </w:pPr>
             <w:r>
+              <w:rPr>
+                <w:rFonts w:ascii="Times New Roman" w:hAnsi="Times New Roman" w:cs="Times New Roman" w:eastAsia="Times New Roman"/>
+                <w:sz w:val="24"/>
+                <w:i w:val="off"/>
+              </w:rPr>
               <w:t/>
             </w:r>
           </w:p>
@@ -1052,6 +838,11 @@
               </w:rPr>
             </w:pPr>
             <w:r>
+              <w:rPr>
+                <w:rFonts w:ascii="Times New Roman" w:hAnsi="Times New Roman" w:cs="Times New Roman" w:eastAsia="Times New Roman"/>
+                <w:sz w:val="24"/>
+                <w:i w:val="off"/>
+              </w:rPr>
               <w:t/>
             </w:r>
           </w:p>
@@ -1074,6 +865,11 @@
               </w:rPr>
             </w:pPr>
             <w:r>
+              <w:rPr>
+                <w:rFonts w:ascii="Times New Roman" w:hAnsi="Times New Roman" w:cs="Times New Roman" w:eastAsia="Times New Roman"/>
+                <w:sz w:val="24"/>
+                <w:i w:val="off"/>
+              </w:rPr>
               <w:t>02</w:t>
             </w:r>
           </w:p>
@@ -1095,6 +891,11 @@
               </w:rPr>
             </w:pPr>
             <w:r>
+              <w:rPr>
+                <w:rFonts w:ascii="Times New Roman" w:hAnsi="Times New Roman" w:cs="Times New Roman" w:eastAsia="Times New Roman"/>
+                <w:sz w:val="24"/>
+                <w:i w:val="off"/>
+              </w:rPr>
               <w:t/>
             </w:r>
           </w:p>
@@ -1116,6 +917,11 @@
               </w:rPr>
             </w:pPr>
             <w:r>
+              <w:rPr>
+                <w:rFonts w:ascii="Times New Roman" w:hAnsi="Times New Roman" w:cs="Times New Roman" w:eastAsia="Times New Roman"/>
+                <w:sz w:val="24"/>
+                <w:i w:val="off"/>
+              </w:rPr>
               <w:t>E2E-TEST third topic</w:t>
             </w:r>
           </w:p>
@@ -1137,6 +943,11 @@
               </w:rPr>
             </w:pPr>
             <w:r>
+              <w:rPr>
+                <w:rFonts w:ascii="Times New Roman" w:hAnsi="Times New Roman" w:cs="Times New Roman" w:eastAsia="Times New Roman"/>
+                <w:sz w:val="24"/>
+                <w:i w:val="off"/>
+              </w:rPr>
               <w:t>Kết hợp / Hybrid</w:t>
             </w:r>
           </w:p>
@@ -1158,6 +969,11 @@
               </w:rPr>
             </w:pPr>
             <w:r>
+              <w:rPr>
+                <w:rFonts w:ascii="Times New Roman" w:hAnsi="Times New Roman" w:cs="Times New Roman" w:eastAsia="Times New Roman"/>
+                <w:sz w:val="24"/>
+                <w:i w:val="off"/>
+              </w:rPr>
               <w:t>Le Thi Hai</w:t>
             </w:r>
           </w:p>
@@ -1178,7 +994,12 @@
               </w:rPr>
             </w:pPr>
             <w:r>
-              <w:t>24/10/2026</w:t>
+              <w:rPr>
+                <w:rFonts w:ascii="Times New Roman" w:hAnsi="Times New Roman" w:cs="Times New Roman" w:eastAsia="Times New Roman"/>
+                <w:sz w:val="24"/>
+                <w:i w:val="off"/>
+              </w:rPr>
+              <w:t>25/10/2026</w:t>
             </w:r>
           </w:p>
         </w:tc>
@@ -1242,6 +1063,11 @@
         </w:rPr>
       </w:pPr>
       <w:r>
+        <w:rPr>
+          <w:rFonts w:ascii="Times New Roman" w:hAnsi="Times New Roman" w:cs="Times New Roman" w:eastAsia="Times New Roman"/>
+          <w:sz w:val="24"/>
+          <w:i w:val="off"/>
+        </w:rPr>
         <w:t xml:space="preserve">01: </w:t>
       </w:r>
     </w:p>
@@ -1573,6 +1399,11 @@
               </w:rPr>
             </w:pPr>
             <w:r>
+              <w:rPr>
+                <w:rFonts w:ascii="Times New Roman" w:hAnsi="Times New Roman" w:cs="Times New Roman" w:eastAsia="Times New Roman"/>
+                <w:sz w:val="24"/>
+                <w:i w:val="off"/>
+              </w:rPr>
               <w:t>1</w:t>
             </w:r>
           </w:p>
@@ -1594,6 +1425,11 @@
               </w:rPr>
             </w:pPr>
             <w:r>
+              <w:rPr>
+                <w:rFonts w:ascii="Times New Roman" w:hAnsi="Times New Roman" w:cs="Times New Roman" w:eastAsia="Times New Roman"/>
+                <w:sz w:val="24"/>
+                <w:i w:val="off"/>
+              </w:rPr>
               <w:t>TEST-DCO-01</w:t>
             </w:r>
           </w:p>
@@ -1615,6 +1451,11 @@
               </w:rPr>
             </w:pPr>
             <w:r>
+              <w:rPr>
+                <w:rFonts w:ascii="Times New Roman" w:hAnsi="Times New Roman" w:cs="Times New Roman" w:eastAsia="Times New Roman"/>
+                <w:sz w:val="24"/>
+                <w:i w:val="off"/>
+              </w:rPr>
               <w:t>DCO Test 1</w:t>
             </w:r>
           </w:p>
@@ -1636,6 +1477,11 @@
               </w:rPr>
             </w:pPr>
             <w:r>
+              <w:rPr>
+                <w:rFonts w:ascii="Times New Roman" w:hAnsi="Times New Roman" w:cs="Times New Roman" w:eastAsia="Times New Roman"/>
+                <w:sz w:val="24"/>
+                <w:i w:val="off"/>
+              </w:rPr>
               <w:t>Quality</w:t>
             </w:r>
           </w:p>
@@ -1657,6 +1503,11 @@
               </w:rPr>
             </w:pPr>
             <w:r>
+              <w:rPr>
+                <w:rFonts w:ascii="Times New Roman" w:hAnsi="Times New Roman" w:cs="Times New Roman" w:eastAsia="Times New Roman"/>
+                <w:sz w:val="24"/>
+                <w:i w:val="off"/>
+              </w:rPr>
               <w:t>Vắng mặt / Absent</w:t>
             </w:r>
           </w:p>
@@ -1678,6 +1529,11 @@
               </w:rPr>
             </w:pPr>
             <w:r>
+              <w:rPr>
+                <w:rFonts w:ascii="Times New Roman" w:hAnsi="Times New Roman" w:cs="Times New Roman" w:eastAsia="Times New Roman"/>
+                <w:sz w:val="24"/>
+                <w:i w:val="off"/>
+              </w:rPr>
               <w:t/>
             </w:r>
           </w:p>
@@ -1699,6 +1555,11 @@
               </w:rPr>
             </w:pPr>
             <w:r>
+              <w:rPr>
+                <w:rFonts w:ascii="Times New Roman" w:hAnsi="Times New Roman" w:cs="Times New Roman" w:eastAsia="Times New Roman"/>
+                <w:sz w:val="24"/>
+                <w:i w:val="off"/>
+              </w:rPr>
               <w:t/>
             </w:r>
           </w:p>
@@ -1722,6 +1583,11 @@
               </w:rPr>
             </w:pPr>
             <w:r>
+              <w:rPr>
+                <w:rFonts w:ascii="Times New Roman" w:hAnsi="Times New Roman" w:cs="Times New Roman" w:eastAsia="Times New Roman"/>
+                <w:sz w:val="24"/>
+                <w:i w:val="off"/>
+              </w:rPr>
               <w:t>2</w:t>
             </w:r>
           </w:p>
@@ -1743,6 +1609,11 @@
               </w:rPr>
             </w:pPr>
             <w:r>
+              <w:rPr>
+                <w:rFonts w:ascii="Times New Roman" w:hAnsi="Times New Roman" w:cs="Times New Roman" w:eastAsia="Times New Roman"/>
+                <w:sz w:val="24"/>
+                <w:i w:val="off"/>
+              </w:rPr>
               <w:t>TEST-USER-A</w:t>
             </w:r>
           </w:p>
@@ -1764,6 +1635,11 @@
               </w:rPr>
             </w:pPr>
             <w:r>
+              <w:rPr>
+                <w:rFonts w:ascii="Times New Roman" w:hAnsi="Times New Roman" w:cs="Times New Roman" w:eastAsia="Times New Roman"/>
+                <w:sz w:val="24"/>
+                <w:i w:val="off"/>
+              </w:rPr>
               <w:t>User A (DCO Test)</w:t>
             </w:r>
           </w:p>
@@ -1785,6 +1661,11 @@
               </w:rPr>
             </w:pPr>
             <w:r>
+              <w:rPr>
+                <w:rFonts w:ascii="Times New Roman" w:hAnsi="Times New Roman" w:cs="Times New Roman" w:eastAsia="Times New Roman"/>
+                <w:sz w:val="24"/>
+                <w:i w:val="off"/>
+              </w:rPr>
               <w:t>Quality Assurance</w:t>
             </w:r>
           </w:p>
@@ -1806,6 +1687,11 @@
               </w:rPr>
             </w:pPr>
             <w:r>
+              <w:rPr>
+                <w:rFonts w:ascii="Times New Roman" w:hAnsi="Times New Roman" w:cs="Times New Roman" w:eastAsia="Times New Roman"/>
+                <w:sz w:val="24"/>
+                <w:i w:val="off"/>
+              </w:rPr>
               <w:t>Có mặt / Present</w:t>
             </w:r>
           </w:p>
@@ -1827,7 +1713,12 @@
               </w:rPr>
             </w:pPr>
             <w:r>
-              <w:t>Không đạt / Failed</w:t>
+              <w:rPr>
+                <w:rFonts w:ascii="Times New Roman" w:hAnsi="Times New Roman" w:cs="Times New Roman" w:eastAsia="Times New Roman"/>
+                <w:sz w:val="24"/>
+                <w:i w:val="off"/>
+              </w:rPr>
+              <w:t/>
             </w:r>
           </w:p>
         </w:tc>
@@ -1848,6 +1739,11 @@
               </w:rPr>
             </w:pPr>
             <w:r>
+              <w:rPr>
+                <w:rFonts w:ascii="Times New Roman" w:hAnsi="Times New Roman" w:cs="Times New Roman" w:eastAsia="Times New Roman"/>
+                <w:sz w:val="24"/>
+                <w:i w:val="off"/>
+              </w:rPr>
               <w:t/>
             </w:r>
           </w:p>
@@ -1866,6 +1762,11 @@
         </w:rPr>
       </w:pPr>
       <w:r>
+        <w:rPr>
+          <w:rFonts w:ascii="Times New Roman" w:hAnsi="Times New Roman" w:cs="Times New Roman" w:eastAsia="Times New Roman"/>
+          <w:sz w:val="24"/>
+          <w:i w:val="off"/>
+        </w:rPr>
         <w:t xml:space="preserve">02: </w:t>
       </w:r>
     </w:p>
@@ -2197,6 +2098,11 @@
               </w:rPr>
             </w:pPr>
             <w:r>
+              <w:rPr>
+                <w:rFonts w:ascii="Times New Roman" w:hAnsi="Times New Roman" w:cs="Times New Roman" w:eastAsia="Times New Roman"/>
+                <w:sz w:val="24"/>
+                <w:i w:val="off"/>
+              </w:rPr>
               <w:t>1</w:t>
             </w:r>
           </w:p>
@@ -2218,6 +2124,11 @@
               </w:rPr>
             </w:pPr>
             <w:r>
+              <w:rPr>
+                <w:rFonts w:ascii="Times New Roman" w:hAnsi="Times New Roman" w:cs="Times New Roman" w:eastAsia="Times New Roman"/>
+                <w:sz w:val="24"/>
+                <w:i w:val="off"/>
+              </w:rPr>
               <w:t>TEST-USER-A</w:t>
             </w:r>
           </w:p>
@@ -2239,6 +2150,11 @@
               </w:rPr>
             </w:pPr>
             <w:r>
+              <w:rPr>
+                <w:rFonts w:ascii="Times New Roman" w:hAnsi="Times New Roman" w:cs="Times New Roman" w:eastAsia="Times New Roman"/>
+                <w:sz w:val="24"/>
+                <w:i w:val="off"/>
+              </w:rPr>
               <w:t>User A (DCO Test)</w:t>
             </w:r>
           </w:p>
@@ -2260,6 +2176,11 @@
               </w:rPr>
             </w:pPr>
             <w:r>
+              <w:rPr>
+                <w:rFonts w:ascii="Times New Roman" w:hAnsi="Times New Roman" w:cs="Times New Roman" w:eastAsia="Times New Roman"/>
+                <w:sz w:val="24"/>
+                <w:i w:val="off"/>
+              </w:rPr>
               <w:t>Quality Assurance</w:t>
             </w:r>
           </w:p>
@@ -2281,6 +2202,11 @@
               </w:rPr>
             </w:pPr>
             <w:r>
+              <w:rPr>
+                <w:rFonts w:ascii="Times New Roman" w:hAnsi="Times New Roman" w:cs="Times New Roman" w:eastAsia="Times New Roman"/>
+                <w:sz w:val="24"/>
+                <w:i w:val="off"/>
+              </w:rPr>
               <w:t>Trực tuyến / Online</w:t>
             </w:r>
           </w:p>
@@ -2302,7 +2228,12 @@
               </w:rPr>
             </w:pPr>
             <w:r>
-              <w:t>Đạt / Passed</w:t>
+              <w:rPr>
+                <w:rFonts w:ascii="Times New Roman" w:hAnsi="Times New Roman" w:cs="Times New Roman" w:eastAsia="Times New Roman"/>
+                <w:sz w:val="24"/>
+                <w:i w:val="off"/>
+              </w:rPr>
+              <w:t/>
             </w:r>
           </w:p>
         </w:tc>
@@ -2323,6 +2254,11 @@
               </w:rPr>
             </w:pPr>
             <w:r>
+              <w:rPr>
+                <w:rFonts w:ascii="Times New Roman" w:hAnsi="Times New Roman" w:cs="Times New Roman" w:eastAsia="Times New Roman"/>
+                <w:sz w:val="24"/>
+                <w:i w:val="off"/>
+              </w:rPr>
               <w:t/>
             </w:r>
           </w:p>
@@ -2535,6 +2471,11 @@
               <w:spacing w:line="312" w:lineRule="auto"/>
             </w:pPr>
             <w:r>
+              <w:rPr>
+                <w:rFonts w:ascii="Times New Roman" w:hAnsi="Times New Roman" w:cs="Times New Roman" w:eastAsia="Times New Roman"/>
+                <w:sz w:val="24"/>
+                <w:i w:val="off"/>
+              </w:rPr>
               <w:t>Nguyen The Hoang</w:t>
             </w:r>
           </w:p>
@@ -2542,16 +2483,124 @@
         <w:tc>
           <w:tcPr>
             <w:tcW w:w="2225" w:type="pct"/>
-          </w:tcPr>
-          <w:p>
-            <w:pPr>
-              <w:tabs>
-                <w:tab w:val="left" w:pos="1985"/>
-              </w:tabs>
-              <w:spacing w:line="312" w:lineRule="auto"/>
-            </w:pPr>
-            <w:r>
-              <w:t>Ký điện tử / Signed electronically 24/10/2026 13:39:38</w:t>
+            <w:vAlign w:val="top"/>
+          </w:tcPr>
+          <w:p>
+            <w:pPr>
+              <w:tabs>
+                <w:tab w:val="left" w:pos="1985"/>
+              </w:tabs>
+              <w:spacing w:line="312" w:lineRule="auto"/>
+            </w:pPr>
+            <w:r>
+              <w:rPr>
+                <w:rFonts w:ascii="Times New Roman" w:hAnsi="Times New Roman" w:cs="Times New Roman" w:eastAsia="Times New Roman"/>
+                <w:sz w:val="24"/>
+                <w:i w:val="off"/>
+              </w:rPr>
+              <w:t/>
+            </w:r>
+          </w:p>
+          <w:p>
+            <w:pPr>
+              <w:tabs>
+                <w:tab w:val="left" w:pos="1985"/>
+              </w:tabs>
+              <w:spacing w:line="240" w:lineRule="auto" w:before="0" w:after="0"/>
+              <w:jc w:val="center"/>
+            </w:pPr>
+            <w:r>
+              <w:rPr>
+                <w:rFonts w:ascii="Times New Roman" w:hAnsi="Times New Roman" w:cs="Times New Roman"/>
+                <w:sz w:val="17"/>
+                <w:szCs w:val="17"/>
+              </w:rPr>
+              <w:t xml:space="preserve">Nguyen The Hoang</w:t>
+            </w:r>
+          </w:p>
+          <w:p>
+            <w:pPr>
+              <w:tabs>
+                <w:tab w:val="left" w:pos="1985"/>
+              </w:tabs>
+              <w:spacing w:line="240" w:lineRule="auto" w:before="0" w:after="0"/>
+              <w:jc w:val="center"/>
+            </w:pPr>
+            <w:r>
+              <w:rPr>
+                <w:rFonts w:ascii="Times New Roman" w:hAnsi="Times New Roman" w:cs="Times New Roman"/>
+                <w:sz w:val="17"/>
+                <w:szCs w:val="17"/>
+              </w:rPr>
+              <w:t xml:space="preserve">Electronically Signed</w:t>
+            </w:r>
+          </w:p>
+          <w:p>
+            <w:pPr>
+              <w:tabs>
+                <w:tab w:val="left" w:pos="1985"/>
+              </w:tabs>
+              <w:spacing w:line="240" w:lineRule="auto" w:before="0" w:after="0"/>
+              <w:jc w:val="center"/>
+            </w:pPr>
+            <w:r>
+              <w:rPr>
+                <w:rFonts w:ascii="Times New Roman" w:hAnsi="Times New Roman" w:cs="Times New Roman"/>
+                <w:sz w:val="17"/>
+                <w:szCs w:val="17"/>
+              </w:rPr>
+              <w:t xml:space="preserve">25/10/2026 21:13:32 (UTC+7)</w:t>
+            </w:r>
+          </w:p>
+          <w:p>
+            <w:pPr>
+              <w:tabs>
+                <w:tab w:val="left" w:pos="1985"/>
+              </w:tabs>
+              <w:spacing w:line="240" w:lineRule="auto" w:before="0" w:after="0"/>
+              <w:jc w:val="center"/>
+            </w:pPr>
+            <w:r>
+              <w:rPr>
+                <w:rFonts w:ascii="Times New Roman" w:hAnsi="Times New Roman" w:cs="Times New Roman"/>
+                <w:sz w:val="17"/>
+                <w:szCs w:val="17"/>
+              </w:rPr>
+              <w:t xml:space="preserve">Meaning: Attendance List Verified</w:t>
+            </w:r>
+          </w:p>
+          <w:p>
+            <w:pPr>
+              <w:tabs>
+                <w:tab w:val="left" w:pos="1985"/>
+              </w:tabs>
+              <w:spacing w:line="240" w:lineRule="auto" w:before="0" w:after="0"/>
+              <w:jc w:val="center"/>
+            </w:pPr>
+            <w:r>
+              <w:rPr>
+                <w:rFonts w:ascii="Times New Roman" w:hAnsi="Times New Roman" w:cs="Times New Roman"/>
+                <w:sz w:val="17"/>
+                <w:szCs w:val="17"/>
+              </w:rPr>
+              <w:t xml:space="preserve">Reason: E2E-TEST</w:t>
+            </w:r>
+          </w:p>
+          <w:p>
+            <w:pPr>
+              <w:tabs>
+                <w:tab w:val="left" w:pos="1985"/>
+              </w:tabs>
+              <w:spacing w:line="240" w:lineRule="auto" w:before="0" w:after="0"/>
+              <w:jc w:val="center"/>
+            </w:pPr>
+            <w:r>
+              <w:rPr>
+                <w:rFonts w:ascii="Times New Roman" w:hAnsi="Times New Roman" w:cs="Times New Roman"/>
+                <w:sz w:val="17"/>
+                <w:szCs w:val="17"/>
+              </w:rPr>
+              <w:t xml:space="preserve">Signature ID: ESIG-2026-006285</w:t>
             </w:r>
           </w:p>
         </w:tc>
@@ -2774,6 +2823,11 @@
               <w:spacing w:line="312" w:lineRule="auto"/>
             </w:pPr>
             <w:r>
+              <w:rPr>
+                <w:rFonts w:ascii="Times New Roman" w:hAnsi="Times New Roman" w:cs="Times New Roman" w:eastAsia="Times New Roman"/>
+                <w:sz w:val="24"/>
+                <w:i w:val="off"/>
+              </w:rPr>
               <w:t>01</w:t>
             </w:r>
           </w:p>
@@ -2790,6 +2844,11 @@
               <w:spacing w:line="312" w:lineRule="auto"/>
             </w:pPr>
             <w:r>
+              <w:rPr>
+                <w:rFonts w:ascii="Times New Roman" w:hAnsi="Times New Roman" w:cs="Times New Roman" w:eastAsia="Times New Roman"/>
+                <w:sz w:val="24"/>
+                <w:i w:val="off"/>
+              </w:rPr>
               <w:t>Tran Van Ngoai</w:t>
             </w:r>
           </w:p>
@@ -2797,15 +2856,21 @@
         <w:tc>
           <w:tcPr>
             <w:tcW w:w="1865" w:type="pct"/>
-          </w:tcPr>
-          <w:p>
-            <w:pPr>
-              <w:tabs>
-                <w:tab w:val="left" w:pos="1985"/>
-              </w:tabs>
-              <w:spacing w:line="312" w:lineRule="auto"/>
-            </w:pPr>
-            <w:r>
+            <w:vAlign w:val="top"/>
+          </w:tcPr>
+          <w:p>
+            <w:pPr>
+              <w:tabs>
+                <w:tab w:val="left" w:pos="1985"/>
+              </w:tabs>
+              <w:spacing w:line="312" w:lineRule="auto"/>
+            </w:pPr>
+            <w:r>
+              <w:rPr>
+                <w:rFonts w:ascii="Times New Roman" w:hAnsi="Times New Roman" w:cs="Times New Roman" w:eastAsia="Times New Roman"/>
+                <w:sz w:val="24"/>
+                <w:i w:val="off"/>
+              </w:rPr>
               <w:t/>
             </w:r>
           </w:p>
@@ -2824,6 +2889,11 @@
               <w:spacing w:line="312" w:lineRule="auto"/>
             </w:pPr>
             <w:r>
+              <w:rPr>
+                <w:rFonts w:ascii="Times New Roman" w:hAnsi="Times New Roman" w:cs="Times New Roman" w:eastAsia="Times New Roman"/>
+                <w:sz w:val="24"/>
+                <w:i w:val="off"/>
+              </w:rPr>
               <w:t>02</w:t>
             </w:r>
           </w:p>
@@ -2840,6 +2910,11 @@
               <w:spacing w:line="312" w:lineRule="auto"/>
             </w:pPr>
             <w:r>
+              <w:rPr>
+                <w:rFonts w:ascii="Times New Roman" w:hAnsi="Times New Roman" w:cs="Times New Roman" w:eastAsia="Times New Roman"/>
+                <w:sz w:val="24"/>
+                <w:i w:val="off"/>
+              </w:rPr>
               <w:t>Le Thi Hai</w:t>
             </w:r>
           </w:p>
@@ -2847,15 +2922,21 @@
         <w:tc>
           <w:tcPr>
             <w:tcW w:w="1865" w:type="pct"/>
-          </w:tcPr>
-          <w:p>
-            <w:pPr>
-              <w:tabs>
-                <w:tab w:val="left" w:pos="1985"/>
-              </w:tabs>
-              <w:spacing w:line="312" w:lineRule="auto"/>
-            </w:pPr>
-            <w:r>
+            <w:vAlign w:val="top"/>
+          </w:tcPr>
+          <w:p>
+            <w:pPr>
+              <w:tabs>
+                <w:tab w:val="left" w:pos="1985"/>
+              </w:tabs>
+              <w:spacing w:line="312" w:lineRule="auto"/>
+            </w:pPr>
+            <w:r>
+              <w:rPr>
+                <w:rFonts w:ascii="Times New Roman" w:hAnsi="Times New Roman" w:cs="Times New Roman" w:eastAsia="Times New Roman"/>
+                <w:sz w:val="24"/>
+                <w:i w:val="off"/>
+              </w:rPr>
               <w:t/>
             </w:r>
           </w:p>
@@ -3066,15 +3147,21 @@
         <w:tc>
           <w:tcPr>
             <w:tcW w:w="4814" w:type="dxa"/>
-          </w:tcPr>
-          <w:p>
-            <w:pPr>
-              <w:tabs>
-                <w:tab w:val="left" w:pos="1985"/>
-              </w:tabs>
-              <w:spacing w:line="312" w:lineRule="auto"/>
-            </w:pPr>
-            <w:r>
+            <w:vAlign w:val="top"/>
+          </w:tcPr>
+          <w:p>
+            <w:pPr>
+              <w:tabs>
+                <w:tab w:val="left" w:pos="1985"/>
+              </w:tabs>
+              <w:spacing w:line="312" w:lineRule="auto"/>
+            </w:pPr>
+            <w:r>
+              <w:rPr>
+                <w:rFonts w:ascii="Times New Roman" w:hAnsi="Times New Roman" w:cs="Times New Roman" w:eastAsia="Times New Roman"/>
+                <w:sz w:val="24"/>
+                <w:i w:val="off"/>
+              </w:rPr>
               <w:t/>
             </w:r>
           </w:p>
@@ -3083,6 +3170,7 @@
     </w:tbl>
     <w:sectPr>
       <w:footerReference w:type="default" r:id="rId12"/>
+      <w:headerReference w:type="default" r:id="rId15"/>
       <w:pgSz w:w="11906" w:h="16838" w:code="9"/>
       <w:pgMar w:top="1474" w:right="851" w:bottom="680" w:left="1418" w:header="1474" w:footer="567" w:gutter="0"/>
       <w:cols w:space="720"/>
@@ -3115,26 +3203,112 @@
 <w:ftr xmlns:wpc="http://schemas.microsoft.com/office/word/2010/wordprocessingCanvas" xmlns:cx="http://schemas.microsoft.com/office/drawing/2014/chartex" xmlns:cx1="http://schemas.microsoft.com/office/drawing/2015/9/8/chartex" xmlns:cx2="http://schemas.microsoft.com/office/drawing/2015/10/21/chartex" xmlns:cx3="http://schemas.microsoft.com/office/drawing/2016/5/9/chartex" xmlns:cx4="http://schemas.microsoft.com/office/drawing/2016/5/10/chartex" xmlns:cx5="http://schemas.microsoft.com/office/drawing/2016/5/11/chartex" xmlns:cx6="http://schemas.microsoft.com/office/drawing/2016/5/12/chartex" xmlns:cx7="http://schemas.microsoft.com/office/drawing/2016/5/13/chartex" xmlns:cx8="http://schemas.microsoft.com/office/drawing/2016/5/14/chartex" xmlns:mc="http://schemas.openxmlformats.org/markup-compatibility/2006" xmlns:aink="http://schemas.microsoft.com/office/drawing/2016/ink" xmlns:am3d="http://schemas.microsoft.com/office/drawing/2017/model3d" xmlns:o="urn:schemas-microsoft-com:office:office" xmlns:oel="http://schemas.microsoft.com/office/2019/extlst" xmlns:r="http://schemas.openxmlformats.org/officeDocument/2006/relationships" xmlns:m="http://schemas.openxmlformats.org/officeDocument/2006/math" xmlns:v="urn:schemas-microsoft-com:vml" xmlns:wp14="http://schemas.microsoft.com/office/word/2010/wordprocessingDrawing" xmlns:wp="http://schemas.openxmlformats.org/drawingml/2006/wordprocessingDrawing" xmlns:w10="urn:schemas-microsoft-com:office:word" xmlns:w="http://schemas.openxmlformats.org/wordprocessingml/2006/main" xmlns:w14="http://schemas.microsoft.com/office/word/2010/wordml" xmlns:w15="http://schemas.microsoft.com/office/word/2012/wordml" xmlns:w16cex="http://schemas.microsoft.com/office/word/2018/wordml/cex" xmlns:w16cid="http://schemas.microsoft.com/office/word/2016/wordml/cid" xmlns:w16="http://schemas.microsoft.com/office/word/2018/wordml" xmlns:w16du="http://schemas.microsoft.com/office/word/2023/wordml/word16du" xmlns:w16sdtdh="http://schemas.microsoft.com/office/word/2020/wordml/sdtdatahash" xmlns:w16sdtfl="http://schemas.microsoft.com/office/word/2024/wordml/sdtformatlock" xmlns:w16se="http://schemas.microsoft.com/office/word/2015/wordml/symex" xmlns:wpg="http://schemas.microsoft.com/office/word/2010/wordprocessingGroup" xmlns:wpi="http://schemas.microsoft.com/office/word/2010/wordprocessingInk" xmlns:wne="http://schemas.microsoft.com/office/word/2006/wordml" xmlns:wps="http://schemas.microsoft.com/office/word/2010/wordprocessingShape" mc:Ignorable="w14 w15 w16se w16cid w16 w16cex w16sdtdh w16sdtfl w16du wp14">
   <w:p>
     <w:pPr>
-      <w:pStyle w:val="Footer"/>
+      <w:pStyle w:val="t2"/>
+      <w:numPr>
+        <w:ilvl w:val="0"/>
+        <w:numId w:val="0"/>
+      </w:numPr>
+      <w:tabs>
+        <w:tab w:val="left" w:pos="720"/>
+      </w:tabs>
+      <w:spacing w:before="0" w:after="0" w:line="312" w:lineRule="auto"/>
       <w:rPr>
-        <w:b/>
-        <w:bCs/>
-        <w:sz w:val="26"/>
-        <w:szCs w:val="26"/>
+        <w:rFonts w:ascii="Times New Roman" w:hAnsi="Times New Roman"/>
+        <w:i/>
+        <w:sz w:val="20"/>
+        <w:szCs w:val="20"/>
       </w:rPr>
     </w:pPr>
-    <w:bookmarkStart w:id="1" w:name="_Hlk199174945"/>
     <w:r>
       <w:rPr>
-        <w:bCs/>
+        <w:rFonts w:ascii="Times New Roman" w:hAnsi="Times New Roman"/>
         <w:i/>
-        <w:iCs/>
         <w:sz w:val="20"/>
-        <w:lang w:val="fr-FR"/>
+        <w:szCs w:val="20"/>
       </w:rPr>
-      <w:t xml:space="preserve"> </w:t>
+      <w:t xml:space="preserve">Document template complies with requirement of </w:t>
     </w:r>
-    <w:bookmarkEnd w:id="1"/>
+    <w:r>
+      <w:rPr>
+        <w:rFonts w:ascii="Times New Roman" w:hAnsi="Times New Roman"/>
+        <w:i/>
+        <w:sz w:val="20"/>
+        <w:szCs w:val="20"/>
+      </w:rPr>
+      <w:t>APD.0</w:t>
+    </w:r>
+    <w:r>
+      <w:rPr>
+        <w:rFonts w:ascii="Times New Roman" w:hAnsi="Times New Roman"/>
+        <w:i/>
+        <w:sz w:val="20"/>
+        <w:szCs w:val="20"/>
+      </w:rPr>
+      <w:t>117</w:t>
+    </w:r>
+    <w:r>
+      <w:rPr>
+        <w:rFonts w:ascii="Times New Roman" w:hAnsi="Times New Roman"/>
+        <w:i/>
+        <w:sz w:val="20"/>
+        <w:szCs w:val="20"/>
+      </w:rPr>
+      <w:t xml:space="preserve"> (version </w:t>
+    </w:r>
+    <w:r>
+      <w:rPr>
+        <w:rFonts w:ascii="Times New Roman" w:hAnsi="Times New Roman"/>
+        <w:i/>
+        <w:sz w:val="20"/>
+        <w:szCs w:val="20"/>
+      </w:rPr>
+      <w:t>1</w:t>
+    </w:r>
+    <w:r>
+      <w:rPr>
+        <w:rFonts w:ascii="Times New Roman" w:hAnsi="Times New Roman"/>
+        <w:i/>
+        <w:sz w:val="20"/>
+        <w:szCs w:val="20"/>
+      </w:rPr>
+      <w:t xml:space="preserve">.0.0) – SOP </w:t>
+    </w:r>
+    <w:r>
+      <w:rPr>
+        <w:rFonts w:ascii="Times New Roman" w:hAnsi="Times New Roman"/>
+        <w:i/>
+        <w:sz w:val="20"/>
+        <w:szCs w:val="20"/>
+      </w:rPr>
+      <w:t>“</w:t>
+    </w:r>
+    <w:r>
+      <w:rPr>
+        <w:rFonts w:ascii="Times New Roman" w:hAnsi="Times New Roman"/>
+        <w:i/>
+        <w:sz w:val="20"/>
+        <w:szCs w:val="20"/>
+      </w:rPr>
+      <w:t>Training</w:t>
+    </w:r>
+    <w:r>
+      <w:rPr>
+        <w:rFonts w:ascii="Times New Roman" w:hAnsi="Times New Roman"/>
+        <w:i/>
+        <w:sz w:val="20"/>
+        <w:szCs w:val="20"/>
+      </w:rPr>
+      <w:t xml:space="preserve">” code: </w:t>
+    </w:r>
+    <w:r>
+      <w:rPr>
+        <w:rFonts w:ascii="Times New Roman" w:hAnsi="Times New Roman"/>
+        <w:i/>
+        <w:sz w:val="20"/>
+        <w:szCs w:val="20"/>
+      </w:rPr>
+      <w:t>SOP.0003</w:t>
+    </w:r>
   </w:p>
 </w:ftr>
 </file>
@@ -3156,6 +3330,307 @@
     </w:p>
   </w:footnote>
 </w:footnotes>
+</file>
+
+<file path=word/header1.xml><?xml version="1.0" encoding="utf-8"?>
+<w:hdr xmlns:w="http://schemas.openxmlformats.org/wordprocessingml/2006/main">
+  <w:tbl xmlns:aink="http://schemas.microsoft.com/office/drawing/2016/ink" xmlns:w16du="http://schemas.microsoft.com/office/word/2023/wordml/word16du" xmlns:w16se="http://schemas.microsoft.com/office/word/2015/wordml/symex" xmlns:wp14="http://schemas.microsoft.com/office/word/2010/wordprocessingDrawing" xmlns:w16sdtfl="http://schemas.microsoft.com/office/word/2024/wordml/sdtformatlock" xmlns:w16sdtdh="http://schemas.microsoft.com/office/word/2020/wordml/sdtdatahash" xmlns:am3d="http://schemas.microsoft.com/office/drawing/2017/model3d" xmlns:mc="http://schemas.openxmlformats.org/markup-compatibility/2006" xmlns:oel="http://schemas.microsoft.com/office/2019/extlst" xmlns:w10="urn:schemas-microsoft-com:office:word" xmlns:wp="http://schemas.openxmlformats.org/drawingml/2006/wordprocessingDrawing" xmlns:w15="http://schemas.microsoft.com/office/word/2012/wordml" xmlns:w14="http://schemas.microsoft.com/office/word/2010/wordml" xmlns:cx2="http://schemas.microsoft.com/office/drawing/2015/10/21/chartex" xmlns:cx1="http://schemas.microsoft.com/office/drawing/2015/9/8/chartex" xmlns:w16="http://schemas.microsoft.com/office/word/2018/wordml" xmlns:cx4="http://schemas.microsoft.com/office/drawing/2016/5/10/chartex" xmlns:cx3="http://schemas.microsoft.com/office/drawing/2016/5/9/chartex" xmlns:cx6="http://schemas.microsoft.com/office/drawing/2016/5/12/chartex" xmlns:cx5="http://schemas.microsoft.com/office/drawing/2016/5/11/chartex" xmlns:cx8="http://schemas.microsoft.com/office/drawing/2016/5/14/chartex" xmlns:cx7="http://schemas.microsoft.com/office/drawing/2016/5/13/chartex" xmlns:w16cex="http://schemas.microsoft.com/office/word/2018/wordml/cex" xmlns:wpc="http://schemas.microsoft.com/office/word/2010/wordprocessingCanvas" xmlns:m="http://schemas.openxmlformats.org/officeDocument/2006/math" xmlns:o="urn:schemas-microsoft-com:office:office" xmlns:wpg="http://schemas.microsoft.com/office/word/2010/wordprocessingGroup" xmlns:wne="http://schemas.microsoft.com/office/word/2006/wordml" xmlns:wpi="http://schemas.microsoft.com/office/word/2010/wordprocessingInk" xmlns:r="http://schemas.openxmlformats.org/officeDocument/2006/relationships" xmlns:cx="http://schemas.microsoft.com/office/drawing/2014/chartex" xmlns:v="urn:schemas-microsoft-com:vml" xmlns:wps="http://schemas.microsoft.com/office/word/2010/wordprocessingShape" xmlns:w16cid="http://schemas.microsoft.com/office/word/2016/wordml/cid">
+    <w:tblPr>
+      <w:tblW w:w="9639" w:type="dxa"/>
+      <w:tblInd w:w="108" w:type="dxa"/>
+      <w:tblBorders>
+        <w:top w:val="single" w:sz="8" w:space="0" w:color="auto"/>
+        <w:left w:val="single" w:sz="8" w:space="0" w:color="auto"/>
+        <w:bottom w:val="single" w:sz="8" w:space="0" w:color="auto"/>
+        <w:right w:val="single" w:sz="8" w:space="0" w:color="auto"/>
+        <w:insideH w:val="single" w:sz="8" w:space="0" w:color="auto"/>
+        <w:insideV w:val="single" w:sz="8" w:space="0" w:color="auto"/>
+      </w:tblBorders>
+      <w:tblLayout w:type="fixed"/>
+      <w:tblLook w:val="0000" w:firstRow="0" w:lastRow="0" w:firstColumn="0" w:lastColumn="0" w:noHBand="0" w:noVBand="0"/>
+    </w:tblPr>
+    <w:tblGrid>
+      <w:gridCol w:w="2268"/>
+      <w:gridCol w:w="5418"/>
+      <w:gridCol w:w="1953"/>
+    </w:tblGrid>
+    <w:tr>
+      <w:trPr>
+        <w:cantSplit/>
+        <w:trHeight w:val="702"/>
+      </w:trPr>
+      <w:tc>
+        <w:tcPr>
+          <w:tcW w:w="2268" w:type="dxa"/>
+          <w:vMerge w:val="restart"/>
+          <w:tcBorders>
+            <w:top w:val="single" w:sz="2" w:space="0" w:color="auto"/>
+            <w:left w:val="single" w:sz="2" w:space="0" w:color="auto"/>
+            <w:right w:val="single" w:sz="2" w:space="0" w:color="auto"/>
+          </w:tcBorders>
+          <w:vAlign w:val="center"/>
+        </w:tcPr>
+        <w:p>
+          <w:pPr>
+            <w:spacing w:line="312" w:lineRule="auto"/>
+            <w:jc w:val="center"/>
+            <w:rPr>
+              <w:rFonts w:cs="Times New Roman"/>
+              <w:b/>
+              <w:szCs w:val="24"/>
+            </w:rPr>
+          </w:pPr>
+          <w:r>
+            <w:rPr>
+              <w:rFonts w:cs="Times New Roman"/>
+              <w:noProof/>
+              <w:szCs w:val="24"/>
+            </w:rPr>
+            <w:drawing>
+              <wp:inline distT="0" distB="0" distL="0" distR="0" wp14:anchorId="091E0B2F" wp14:editId="2235FB2A">
+                <wp:extent cx="1135380" cy="823843"/>
+                <wp:effectExtent l="0" t="0" r="7620" b="0"/>
+                <wp:docPr id="1423875943" name="Picture 1423875943"/>
+                <wp:cNvGraphicFramePr>
+                  <a:graphicFrameLocks xmlns:a="http://schemas.openxmlformats.org/drawingml/2006/main" noChangeAspect="1"/>
+                </wp:cNvGraphicFramePr>
+                <a:graphic xmlns:a="http://schemas.openxmlformats.org/drawingml/2006/main">
+                  <a:graphicData uri="http://schemas.openxmlformats.org/drawingml/2006/picture">
+                    <pic:pic xmlns:pic="http://schemas.openxmlformats.org/drawingml/2006/picture">
+                      <pic:nvPicPr>
+                        <pic:cNvPr id="0" name="Picture 1"/>
+                        <pic:cNvPicPr>
+                          <a:picLocks noChangeAspect="1" noChangeArrowheads="1"/>
+                        </pic:cNvPicPr>
+                      </pic:nvPicPr>
+                      <pic:blipFill>
+                        <a:blip r:embed="rId1" cstate="print">
+                          <a:extLst>
+                            <a:ext uri="{28A0092B-C50C-407E-A947-70E740481C1C}">
+                              <a14:useLocalDpi xmlns:a14="http://schemas.microsoft.com/office/drawing/2010/main" val="0"/>
+                            </a:ext>
+                          </a:extLst>
+                        </a:blip>
+                        <a:srcRect/>
+                        <a:stretch>
+                          <a:fillRect/>
+                        </a:stretch>
+                      </pic:blipFill>
+                      <pic:spPr bwMode="auto">
+                        <a:xfrm>
+                          <a:off x="0" y="0"/>
+                          <a:ext cx="1137773" cy="825580"/>
+                        </a:xfrm>
+                        <a:prstGeom prst="rect">
+                          <a:avLst/>
+                        </a:prstGeom>
+                        <a:noFill/>
+                        <a:ln>
+                          <a:noFill/>
+                        </a:ln>
+                      </pic:spPr>
+                    </pic:pic>
+                  </a:graphicData>
+                </a:graphic>
+              </wp:inline>
+            </w:drawing>
+          </w:r>
+        </w:p>
+      </w:tc>
+      <w:tc>
+        <w:tcPr>
+          <w:tcW w:w="5418" w:type="dxa"/>
+          <w:vMerge w:val="restart"/>
+          <w:tcBorders>
+            <w:top w:val="single" w:sz="2" w:space="0" w:color="auto"/>
+            <w:left w:val="single" w:sz="2" w:space="0" w:color="auto"/>
+            <w:right w:val="single" w:sz="2" w:space="0" w:color="auto"/>
+          </w:tcBorders>
+          <w:vAlign w:val="center"/>
+        </w:tcPr>
+        <w:p>
+          <w:pPr>
+            <w:spacing w:line="300" w:lineRule="auto"/>
+            <w:jc w:val="center"/>
+            <w:rPr>
+              <w:b/>
+              <w:sz w:val="30"/>
+              <w:szCs w:val="30"/>
+            </w:rPr>
+          </w:pPr>
+          <w:r>
+            <w:rPr>
+              <w:b/>
+              <w:sz w:val="30"/>
+              <w:szCs w:val="30"/>
+            </w:rPr>
+            <w:t>DANH SÁCH THAM GIA ĐÀO TẠO</w:t>
+          </w:r>
+        </w:p>
+        <w:p>
+          <w:pPr>
+            <w:spacing w:line="300" w:lineRule="auto"/>
+            <w:jc w:val="center"/>
+            <w:rPr>
+              <w:rFonts w:cs="Times New Roman"/>
+              <w:b/>
+              <w:szCs w:val="24"/>
+            </w:rPr>
+          </w:pPr>
+          <w:r>
+            <w:rPr>
+              <w:b/>
+              <w:i/>
+              <w:iCs/>
+              <w:sz w:val="30"/>
+              <w:szCs w:val="30"/>
+            </w:rPr>
+            <w:t xml:space="preserve">TRAINING ATTENDENCE LIST </w:t>
+          </w:r>
+        </w:p>
+      </w:tc>
+      <w:tc>
+        <w:tcPr>
+          <w:tcW w:w="1953" w:type="dxa"/>
+          <w:tcBorders>
+            <w:top w:val="single" w:sz="2" w:space="0" w:color="auto"/>
+            <w:left w:val="single" w:sz="2" w:space="0" w:color="auto"/>
+            <w:bottom w:val="single" w:sz="2" w:space="0" w:color="auto"/>
+            <w:right w:val="single" w:sz="2" w:space="0" w:color="auto"/>
+          </w:tcBorders>
+          <w:vAlign w:val="center"/>
+        </w:tcPr>
+        <w:p>
+          <w:pPr>
+            <w:spacing w:line="312" w:lineRule="auto"/>
+            <w:jc w:val="both"/>
+            <w:rPr>
+              <w:rFonts w:cs="Times New Roman"/>
+              <w:szCs w:val="24"/>
+              <w:lang w:val="vi-VN"/>
+            </w:rPr>
+          </w:pPr>
+          <w:r>
+            <w:rPr>
+              <w:rFonts w:cs="Times New Roman"/>
+              <w:szCs w:val="24"/>
+            </w:rPr>
+            <w:t xml:space="preserve">Page: </w:t>
+          </w:r>
+          <w:fldSimple w:instr=" PAGE ">
+            <w:r>
+              <w:rPr>
+                <w:rFonts w:cs="Times New Roman"/>
+                <w:szCs w:val="24"/>
+              </w:rPr>
+              <w:t>1</w:t>
+            </w:r>
+          </w:fldSimple>
+          <w:r>
+            <w:rPr>
+              <w:rFonts w:cs="Times New Roman"/>
+              <w:szCs w:val="24"/>
+            </w:rPr>
+            <w:t xml:space="preserve"> / </w:t>
+          </w:r>
+          <w:fldSimple w:instr=" NUMPAGES ">
+            <w:r>
+              <w:rPr>
+                <w:rFonts w:cs="Times New Roman"/>
+                <w:szCs w:val="24"/>
+              </w:rPr>
+              <w:t>1</w:t>
+            </w:r>
+          </w:fldSimple>
+        </w:p>
+      </w:tc>
+    </w:tr>
+    <w:tr>
+      <w:trPr>
+        <w:cantSplit/>
+        <w:trHeight w:val="702"/>
+      </w:trPr>
+      <w:tc>
+        <w:tcPr>
+          <w:tcW w:w="2268" w:type="dxa"/>
+          <w:vMerge/>
+          <w:tcBorders>
+            <w:left w:val="single" w:sz="2" w:space="0" w:color="auto"/>
+            <w:bottom w:val="single" w:sz="8" w:space="0" w:color="auto"/>
+            <w:right w:val="single" w:sz="2" w:space="0" w:color="auto"/>
+          </w:tcBorders>
+          <w:vAlign w:val="center"/>
+        </w:tcPr>
+        <w:p>
+          <w:pPr>
+            <w:spacing w:line="312" w:lineRule="auto"/>
+            <w:jc w:val="center"/>
+            <w:rPr>
+              <w:rFonts w:cs="Times New Roman"/>
+              <w:noProof/>
+              <w:szCs w:val="24"/>
+            </w:rPr>
+          </w:pPr>
+        </w:p>
+      </w:tc>
+      <w:tc>
+        <w:tcPr>
+          <w:tcW w:w="5418" w:type="dxa"/>
+          <w:vMerge/>
+          <w:tcBorders>
+            <w:left w:val="single" w:sz="2" w:space="0" w:color="auto"/>
+            <w:bottom w:val="single" w:sz="8" w:space="0" w:color="auto"/>
+            <w:right w:val="single" w:sz="2" w:space="0" w:color="auto"/>
+          </w:tcBorders>
+          <w:vAlign w:val="center"/>
+        </w:tcPr>
+        <w:p>
+          <w:pPr>
+            <w:spacing w:line="300" w:lineRule="auto"/>
+            <w:jc w:val="center"/>
+            <w:rPr>
+              <w:b/>
+              <w:sz w:val="30"/>
+              <w:szCs w:val="30"/>
+            </w:rPr>
+          </w:pPr>
+        </w:p>
+      </w:tc>
+      <w:tc>
+        <w:tcPr>
+          <w:tcW w:w="1953" w:type="dxa"/>
+          <w:tcBorders>
+            <w:top w:val="single" w:sz="2" w:space="0" w:color="auto"/>
+            <w:left w:val="single" w:sz="2" w:space="0" w:color="auto"/>
+            <w:right w:val="single" w:sz="2" w:space="0" w:color="auto"/>
+          </w:tcBorders>
+          <w:vAlign w:val="center"/>
+        </w:tcPr>
+        <w:p>
+          <w:pPr>
+            <w:spacing w:line="312" w:lineRule="auto"/>
+            <w:jc w:val="both"/>
+            <w:rPr>
+              <w:rFonts w:cs="Times New Roman"/>
+              <w:szCs w:val="24"/>
+            </w:rPr>
+          </w:pPr>
+          <w:r>
+            <w:rPr>
+              <w:rFonts w:cs="Times New Roman" w:ascii="Times New Roman" w:hAnsi="Times New Roman" w:eastAsia="Times New Roman"/>
+              <w:szCs w:val="24"/>
+              <w:sz w:val="24"/>
+              <w:i w:val="off"/>
+            </w:rPr>
+            <w:t xml:space="preserve">Code: TRN/QA/26-495</w:t>
+          </w:r>
+        </w:p>
+      </w:tc>
+    </w:tr>
+  </w:tbl>
+  <w:p/>
+  <w:p/>
+</w:hdr>
 </file>
 
 <file path=word/numbering.xml><?xml version="1.0" encoding="utf-8"?>

</xml_diff>

<commit_message>
feat(training): extend job roles, compliance and specimen workflows
</commit_message>
<xml_diff>
--- a/eqms-backend/docs/validation/evidence/training_2026_10_18/exports/APD0117-after-training.docx
+++ b/eqms-backend/docs/validation/evidence/training_2026_10_18/exports/APD0117-after-training.docx
@@ -687,7 +687,7 @@
                 <w:sz w:val="24"/>
                 <w:i w:val="off"/>
               </w:rPr>
-              <w:t>25/10/2026</w:t>
+              <w:t>26/10/2026</w:t>
             </w:r>
           </w:p>
         </w:tc>
@@ -999,7 +999,7 @@
                 <w:sz w:val="24"/>
                 <w:i w:val="off"/>
               </w:rPr>
-              <w:t>25/10/2026</w:t>
+              <w:t>26/10/2026</w:t>
             </w:r>
           </w:p>
         </w:tc>
@@ -2549,7 +2549,7 @@
                 <w:sz w:val="17"/>
                 <w:szCs w:val="17"/>
               </w:rPr>
-              <w:t xml:space="preserve">25/10/2026 21:13:32 (UTC+7)</w:t>
+              <w:t xml:space="preserve">26/10/2026 10:16:09 (UTC+7)</w:t>
             </w:r>
           </w:p>
           <w:p>
@@ -2600,7 +2600,7 @@
                 <w:sz w:val="17"/>
                 <w:szCs w:val="17"/>
               </w:rPr>
-              <w:t xml:space="preserve">Signature ID: ESIG-2026-006285</w:t>
+              <w:t xml:space="preserve">Signature ID: ESIG-2026-007074</w:t>
             </w:r>
           </w:p>
         </w:tc>
@@ -3622,7 +3622,7 @@
               <w:sz w:val="24"/>
               <w:i w:val="off"/>
             </w:rPr>
-            <w:t xml:space="preserve">Code: TRN/QA/26-495</w:t>
+            <w:t xml:space="preserve">Code: TRN/QA/26-611</w:t>
           </w:r>
         </w:p>
       </w:tc>

</xml_diff>

<commit_message>
feat: update training workflows, configuration and shared UI
</commit_message>
<xml_diff>
--- a/eqms-backend/docs/validation/evidence/training_2026_10_18/exports/APD0117-after-training.docx
+++ b/eqms-backend/docs/validation/evidence/training_2026_10_18/exports/APD0117-after-training.docx
@@ -145,7 +145,7 @@
                 <w:sz w:val="24"/>
                 <w:i w:val="off"/>
               </w:rPr>
-              <w:t>E2E-TEST attendance list APD.0117</w:t>
+              <w:t>E2E-TEST first topic; E2E-TEST second topic; E2E-TEST third topic</w:t>
             </w:r>
           </w:p>
         </w:tc>
@@ -687,7 +687,7 @@
                 <w:sz w:val="24"/>
                 <w:i w:val="off"/>
               </w:rPr>
-              <w:t>26/10/2026</w:t>
+              <w:t>27/10/2026</w:t>
             </w:r>
           </w:p>
         </w:tc>
@@ -999,7 +999,7 @@
                 <w:sz w:val="24"/>
                 <w:i w:val="off"/>
               </w:rPr>
-              <w:t>26/10/2026</w:t>
+              <w:t>27/10/2026</w:t>
             </w:r>
           </w:p>
         </w:tc>
@@ -2549,7 +2549,7 @@
                 <w:sz w:val="17"/>
                 <w:szCs w:val="17"/>
               </w:rPr>
-              <w:t xml:space="preserve">26/10/2026 10:16:09 (UTC+7)</w:t>
+              <w:t xml:space="preserve">27/10/2026 17:35 (UTC+7)</w:t>
             </w:r>
           </w:p>
           <w:p>
@@ -2600,7 +2600,7 @@
                 <w:sz w:val="17"/>
                 <w:szCs w:val="17"/>
               </w:rPr>
-              <w:t xml:space="preserve">Signature ID: ESIG-2026-007074</w:t>
+              <w:t xml:space="preserve">Signature ID: ESIG-2026-007735</w:t>
             </w:r>
           </w:p>
         </w:tc>
@@ -3622,7 +3622,7 @@
               <w:sz w:val="24"/>
               <w:i w:val="off"/>
             </w:rPr>
-            <w:t xml:space="preserve">Code: TRN/QA/26-611</w:t>
+            <w:t xml:space="preserve">Code: TRN/QA/26-761</w:t>
           </w:r>
         </w:p>
       </w:tc>

</xml_diff>